<commit_message>
Enlarge equipment budget 130M→150M, add DGX Spark + humanoid robots
Equipment changes:
- Add NVIDIA DGX Spark ×10 (Grace Blackwell, 128GB) for Education/Startup Hub
- Add 4 humanoid robot types: Unitree H1 (research), Fourier GR-2 (healthcare),
  UBTECH Walker S (service), Kepler K2 (industrial) + dev kit
- Category 2 (AI Computing): 65M→67M, Category 3 (Robotics): 50M→68M
- Total equipment: 130M→150M, 61→67 items

Proposal changes:
- Total project: 300M→320M, gov 150M (47%), MFU+others 170M (53%)
- สำนักงบประมาณ review fixes: Cabinet approval, budget channel (อว.),
  CapEx/OpEx classification, procurement plan, personnel detail,
  co-funding commitment, ROI clarification, KPI dimensions
- All funding source paragraphs updated (P83-87, P91, P151)
- Full arithmetic audit: all 67 items verified, zero errors

Co-Authored-By: Claude Opus 4.6 <noreply@anthropic.com>
</commit_message>
<xml_diff>
--- a/MFU_ARIC_Equipment_Specifications_Budget.docx
+++ b/MFU_ARIC_Equipment_Specifications_Budget.docx
@@ -626,7 +626,7 @@
                 <w:sz w:val="32"/>
                 <w:szCs w:val="32"/>
               </w:rPr>
-              <w:t xml:space="preserve">130,000,000 บาท (ร้อยละ 43.3 ของงบโครงการทั้งหมด)</w:t>
+              <w:t xml:space="preserve">150,000,000 บาท (ร้อยละ 46.9 ของงบโครงการทั้งหมด)</w:t>
             </w:r>
           </w:p>
         </w:tc>
@@ -827,46 +827,18 @@
               </w:rPr>
             </w:pPr>
             <w:proofErr w:type="spellStart"/>
-            <w:r>
-              <w:rPr>
-                <w:sz w:val="32"/>
-                <w:szCs w:val="32"/>
-              </w:rPr>
-              <w:t>ครุภัณฑ์</w:t>
-            </w:r>
-            <w:proofErr w:type="spellEnd"/>
-            <w:r>
-              <w:rPr>
-                <w:sz w:val="32"/>
-                <w:szCs w:val="32"/>
-              </w:rPr>
-              <w:t xml:space="preserve"> AI Computing (GPU </w:t>
-            </w:r>
+            <w:proofErr w:type="spellEnd"/>
             <w:proofErr w:type="gramStart"/>
-            <w:r>
-              <w:rPr>
-                <w:sz w:val="32"/>
-                <w:szCs w:val="32"/>
-              </w:rPr>
-              <w:t>Cluster)  :</w:t>
-            </w:r>
             <w:proofErr w:type="gramEnd"/>
-            <w:r>
-              <w:rPr>
-                <w:sz w:val="32"/>
-                <w:szCs w:val="32"/>
-              </w:rPr>
-              <w:t xml:space="preserve">  65,000,000 </w:t>
-            </w:r>
-            <w:proofErr w:type="spellStart"/>
-            <w:r>
-              <w:rPr>
-                <w:sz w:val="32"/>
-                <w:szCs w:val="32"/>
-              </w:rPr>
-              <w:t>บาท</w:t>
-            </w:r>
-            <w:proofErr w:type="spellEnd"/>
+            <w:proofErr w:type="spellStart"/>
+            <w:proofErr w:type="spellEnd"/>
+            <w:r>
+              <w:rPr>
+                <w:sz w:val="32"/>
+                <w:szCs w:val="32"/>
+              </w:rPr>
+              <w:t xml:space="preserve">ครุภัณฑ์ AI Computing (GPU Cluster)  :  67,000,000 บาท</w:t>
+            </w:r>
           </w:p>
         </w:tc>
       </w:tr>
@@ -950,55 +922,20 @@
               </w:rPr>
             </w:pPr>
             <w:proofErr w:type="spellStart"/>
-            <w:r>
-              <w:rPr>
-                <w:sz w:val="32"/>
-                <w:szCs w:val="32"/>
-              </w:rPr>
-              <w:t>ครุภัณฑ์</w:t>
-            </w:r>
-            <w:proofErr w:type="spellEnd"/>
-            <w:r>
-              <w:rPr>
-                <w:sz w:val="32"/>
-                <w:szCs w:val="32"/>
-              </w:rPr>
-              <w:t xml:space="preserve"> Robotics Lab </w:t>
-            </w:r>
+            <w:proofErr w:type="spellEnd"/>
             <w:proofErr w:type="spellStart"/>
             <w:proofErr w:type="gramStart"/>
-            <w:r>
-              <w:rPr>
-                <w:sz w:val="32"/>
-                <w:szCs w:val="32"/>
-              </w:rPr>
-              <w:t>และอุปกรณ์</w:t>
-            </w:r>
-            <w:proofErr w:type="spellEnd"/>
-            <w:r>
-              <w:rPr>
-                <w:sz w:val="32"/>
-                <w:szCs w:val="32"/>
-              </w:rPr>
-              <w:t xml:space="preserve">  :</w:t>
-            </w:r>
+            <w:proofErr w:type="spellEnd"/>
             <w:proofErr w:type="gramEnd"/>
-            <w:r>
-              <w:rPr>
-                <w:sz w:val="32"/>
-                <w:szCs w:val="32"/>
-              </w:rPr>
-              <w:t xml:space="preserve">  50,000,000 </w:t>
-            </w:r>
-            <w:proofErr w:type="spellStart"/>
-            <w:r>
-              <w:rPr>
-                <w:sz w:val="32"/>
-                <w:szCs w:val="32"/>
-              </w:rPr>
-              <w:t>บาท</w:t>
-            </w:r>
-            <w:proofErr w:type="spellEnd"/>
+            <w:proofErr w:type="spellStart"/>
+            <w:proofErr w:type="spellEnd"/>
+            <w:r>
+              <w:rPr>
+                <w:sz w:val="32"/>
+                <w:szCs w:val="32"/>
+              </w:rPr>
+              <w:t xml:space="preserve">ครุภัณฑ์ Robotics Lab และอุปกรณ์  :  68,000,000 บาท</w:t>
+            </w:r>
           </w:p>
         </w:tc>
       </w:tr>
@@ -13426,6 +13363,276 @@
         <w:tc>
           <w:tcPr>
             <w:tcW w:w="0" w:type="auto"/>
+            <w:tcBorders>
+              <w:top w:val="single" w:sz="1" w:space="0" w:color="B0C4DE"/>
+              <w:left w:val="single" w:sz="1" w:space="0" w:color="B0C4DE"/>
+              <w:bottom w:val="single" w:sz="1" w:space="0" w:color="B0C4DE"/>
+              <w:right w:val="single" w:sz="1" w:space="0" w:color="B0C4DE"/>
+            </w:tcBorders>
+            <w:shd w:val="clear" w:color="auto" w:fill="F4F6FA"/>
+            <w:tcMar>
+              <w:top w:w="70" w:type="dxa"/>
+              <w:left w:w="100" w:type="dxa"/>
+              <w:bottom w:w="70" w:type="dxa"/>
+              <w:right w:w="100" w:type="dxa"/>
+            </w:tcMar>
+          </w:tcPr>
+          <w:p>
+            <w:pPr>
+              <w:jc w:val="center"/>
+              <w:rPr>
+                <w:sz w:val="32"/>
+                <w:szCs w:val="32"/>
+              </w:rPr>
+            </w:pPr>
+            <w:r>
+              <w:rPr>
+                <w:color w:val="1A1A2E"/>
+                <w:sz w:val="32"/>
+                <w:szCs w:val="32"/>
+              </w:rPr>
+              <w:t xml:space="preserve">6.5</w:t>
+            </w:r>
+          </w:p>
+        </w:tc>
+        <w:tc>
+          <w:tcPr>
+            <w:tcW w:w="0" w:type="auto"/>
+            <w:tcBorders>
+              <w:top w:val="single" w:sz="1" w:space="0" w:color="B0C4DE"/>
+              <w:left w:val="single" w:sz="1" w:space="0" w:color="B0C4DE"/>
+              <w:bottom w:val="single" w:sz="1" w:space="0" w:color="B0C4DE"/>
+              <w:right w:val="single" w:sz="1" w:space="0" w:color="B0C4DE"/>
+            </w:tcBorders>
+            <w:shd w:val="clear" w:color="auto" w:fill="F4F6FA"/>
+            <w:tcMar>
+              <w:top w:w="70" w:type="dxa"/>
+              <w:left w:w="100" w:type="dxa"/>
+              <w:bottom w:w="70" w:type="dxa"/>
+              <w:right w:w="100" w:type="dxa"/>
+            </w:tcMar>
+          </w:tcPr>
+          <w:p>
+            <w:pPr>
+              <w:rPr>
+                <w:sz w:val="32"/>
+                <w:szCs w:val="32"/>
+              </w:rPr>
+            </w:pPr>
+            <w:proofErr w:type="spellStart"/>
+            <w:proofErr w:type="spellEnd"/>
+            <w:proofErr w:type="spellStart"/>
+            <w:proofErr w:type="spellEnd"/>
+            <w:proofErr w:type="spellStart"/>
+            <w:proofErr w:type="spellEnd"/>
+            <w:r>
+              <w:rPr>
+                <w:b/>
+                <w:bCs/>
+                <w:color w:val="1A1A2E"/>
+                <w:sz w:val="32"/>
+                <w:szCs w:val="32"/>
+              </w:rPr>
+              <w:t xml:space="preserve">NVIDIA DGX Spark Desktop AI Workstation (Leadtek หรือเทียบเท่า)</w:t>
+            </w:r>
+          </w:p>
+        </w:tc>
+        <w:tc>
+          <w:tcPr>
+            <w:tcW w:w="0" w:type="auto"/>
+            <w:tcBorders>
+              <w:top w:val="single" w:sz="1" w:space="0" w:color="B0C4DE"/>
+              <w:left w:val="single" w:sz="1" w:space="0" w:color="B0C4DE"/>
+              <w:bottom w:val="single" w:sz="1" w:space="0" w:color="B0C4DE"/>
+              <w:right w:val="single" w:sz="1" w:space="0" w:color="B0C4DE"/>
+            </w:tcBorders>
+            <w:shd w:val="clear" w:color="auto" w:fill="F4F6FA"/>
+            <w:tcMar>
+              <w:top w:w="70" w:type="dxa"/>
+              <w:left w:w="100" w:type="dxa"/>
+              <w:bottom w:w="70" w:type="dxa"/>
+              <w:right w:w="100" w:type="dxa"/>
+            </w:tcMar>
+          </w:tcPr>
+          <w:p>
+            <w:pPr>
+              <w:rPr>
+                <w:sz w:val="32"/>
+                <w:szCs w:val="32"/>
+              </w:rPr>
+            </w:pPr>
+            <w:proofErr w:type="spellStart"/>
+            <w:proofErr w:type="spellEnd"/>
+            <w:r>
+              <w:rPr>
+                <w:color w:val="1A1A2E"/>
+                <w:sz w:val="32"/>
+                <w:szCs w:val="32"/>
+              </w:rPr>
+              <w:t xml:space="preserve">- NVIDIA GB10 Grace Blackwell Superchip
+- 128 GB Unified Memory (CPU+GPU shared)
+- 1 PFLOPS FP4 AI Performance
+- DGX OS (Ubuntu-based), CUDA, TensorRT, NIM
+- Desktop form factor, พร้อมใช้งาน
+- สำหรับ Education Hub และ Startup Development</w:t>
+            </w:r>
+          </w:p>
+        </w:tc>
+        <w:tc>
+          <w:tcPr>
+            <w:tcW w:w="0" w:type="auto"/>
+            <w:tcBorders>
+              <w:top w:val="single" w:sz="1" w:space="0" w:color="B0C4DE"/>
+              <w:left w:val="single" w:sz="1" w:space="0" w:color="B0C4DE"/>
+              <w:bottom w:val="single" w:sz="1" w:space="0" w:color="B0C4DE"/>
+              <w:right w:val="single" w:sz="1" w:space="0" w:color="B0C4DE"/>
+            </w:tcBorders>
+            <w:shd w:val="clear" w:color="auto" w:fill="F4F6FA"/>
+            <w:tcMar>
+              <w:top w:w="70" w:type="dxa"/>
+              <w:left w:w="100" w:type="dxa"/>
+              <w:bottom w:w="70" w:type="dxa"/>
+              <w:right w:w="100" w:type="dxa"/>
+            </w:tcMar>
+          </w:tcPr>
+          <w:p>
+            <w:pPr>
+              <w:jc w:val="center"/>
+              <w:rPr>
+                <w:sz w:val="32"/>
+                <w:szCs w:val="32"/>
+              </w:rPr>
+            </w:pPr>
+            <w:r>
+              <w:rPr>
+                <w:color w:val="1A1A2E"/>
+                <w:sz w:val="32"/>
+                <w:szCs w:val="32"/>
+              </w:rPr>
+              <w:t xml:space="preserve">10</w:t>
+            </w:r>
+          </w:p>
+        </w:tc>
+        <w:tc>
+          <w:tcPr>
+            <w:tcW w:w="0" w:type="auto"/>
+            <w:tcBorders>
+              <w:top w:val="single" w:sz="1" w:space="0" w:color="B0C4DE"/>
+              <w:left w:val="single" w:sz="1" w:space="0" w:color="B0C4DE"/>
+              <w:bottom w:val="single" w:sz="1" w:space="0" w:color="B0C4DE"/>
+              <w:right w:val="single" w:sz="1" w:space="0" w:color="B0C4DE"/>
+            </w:tcBorders>
+            <w:shd w:val="clear" w:color="auto" w:fill="F4F6FA"/>
+            <w:tcMar>
+              <w:top w:w="70" w:type="dxa"/>
+              <w:left w:w="100" w:type="dxa"/>
+              <w:bottom w:w="70" w:type="dxa"/>
+              <w:right w:w="100" w:type="dxa"/>
+            </w:tcMar>
+          </w:tcPr>
+          <w:p>
+            <w:pPr>
+              <w:jc w:val="center"/>
+              <w:rPr>
+                <w:sz w:val="32"/>
+                <w:szCs w:val="32"/>
+              </w:rPr>
+            </w:pPr>
+            <w:proofErr w:type="spellStart"/>
+            <w:proofErr w:type="spellEnd"/>
+            <w:r>
+              <w:rPr>
+                <w:color w:val="1A1A2E"/>
+                <w:sz w:val="32"/>
+                <w:szCs w:val="32"/>
+              </w:rPr>
+              <w:t xml:space="preserve">เครื่อง</w:t>
+            </w:r>
+          </w:p>
+        </w:tc>
+        <w:tc>
+          <w:tcPr>
+            <w:tcW w:w="0" w:type="auto"/>
+            <w:tcBorders>
+              <w:top w:val="single" w:sz="1" w:space="0" w:color="B0C4DE"/>
+              <w:left w:val="single" w:sz="1" w:space="0" w:color="B0C4DE"/>
+              <w:bottom w:val="single" w:sz="1" w:space="0" w:color="B0C4DE"/>
+              <w:right w:val="single" w:sz="1" w:space="0" w:color="B0C4DE"/>
+            </w:tcBorders>
+            <w:shd w:val="clear" w:color="auto" w:fill="F4F6FA"/>
+            <w:tcMar>
+              <w:top w:w="70" w:type="dxa"/>
+              <w:left w:w="100" w:type="dxa"/>
+              <w:bottom w:w="70" w:type="dxa"/>
+              <w:right w:w="100" w:type="dxa"/>
+            </w:tcMar>
+          </w:tcPr>
+          <w:p>
+            <w:pPr>
+              <w:jc w:val="center"/>
+              <w:rPr>
+                <w:sz w:val="32"/>
+                <w:szCs w:val="32"/>
+              </w:rPr>
+            </w:pPr>
+            <w:r>
+              <w:rPr>
+                <w:color w:val="1A1A2E"/>
+                <w:sz w:val="32"/>
+                <w:szCs w:val="32"/>
+              </w:rPr>
+              <w:t xml:space="preserve">200,000</w:t>
+            </w:r>
+          </w:p>
+        </w:tc>
+        <w:tc>
+          <w:tcPr>
+            <w:tcW w:w="0" w:type="auto"/>
+            <w:tcBorders>
+              <w:top w:val="single" w:sz="1" w:space="0" w:color="B0C4DE"/>
+              <w:left w:val="single" w:sz="1" w:space="0" w:color="B0C4DE"/>
+              <w:bottom w:val="single" w:sz="1" w:space="0" w:color="B0C4DE"/>
+              <w:right w:val="single" w:sz="1" w:space="0" w:color="B0C4DE"/>
+            </w:tcBorders>
+            <w:shd w:val="clear" w:color="auto" w:fill="F4F6FA"/>
+            <w:tcMar>
+              <w:top w:w="70" w:type="dxa"/>
+              <w:left w:w="100" w:type="dxa"/>
+              <w:bottom w:w="70" w:type="dxa"/>
+              <w:right w:w="100" w:type="dxa"/>
+            </w:tcMar>
+          </w:tcPr>
+          <w:p>
+            <w:pPr>
+              <w:jc w:val="center"/>
+              <w:rPr>
+                <w:sz w:val="32"/>
+                <w:szCs w:val="32"/>
+              </w:rPr>
+            </w:pPr>
+            <w:r>
+              <w:rPr>
+                <w:b/>
+                <w:bCs/>
+                <w:color w:val="1A3A6B"/>
+                <w:sz w:val="32"/>
+                <w:szCs w:val="32"/>
+              </w:rPr>
+              <w:t xml:space="preserve">2,000,000</w:t>
+            </w:r>
+          </w:p>
+        </w:tc>
+      </w:tr>
+      <w:tr>
+        <w:tblPrEx>
+          <w:tblCellMar>
+            <w:top w:w="0" w:type="dxa"/>
+            <w:bottom w:w="0" w:type="dxa"/>
+          </w:tblCellMar>
+        </w:tblPrEx>
+        <w:tc>
+          <w:tcPr>
+            <w:tcW w:w="0" w:type="auto"/>
             <w:gridSpan w:val="6"/>
             <w:tcBorders>
               <w:top w:val="single" w:sz="1" w:space="0" w:color="2B5EA7"/>
@@ -13449,6 +13656,7 @@
               </w:rPr>
             </w:pPr>
             <w:proofErr w:type="spellStart"/>
+            <w:proofErr w:type="spellEnd"/>
             <w:r>
               <w:rPr>
                 <w:b/>
@@ -13457,18 +13665,7 @@
                 <w:sz w:val="32"/>
                 <w:szCs w:val="32"/>
               </w:rPr>
-              <w:t>รวม</w:t>
-            </w:r>
-            <w:proofErr w:type="spellEnd"/>
-            <w:r>
-              <w:rPr>
-                <w:b/>
-                <w:bCs/>
-                <w:color w:val="1A3A6B"/>
-                <w:sz w:val="32"/>
-                <w:szCs w:val="32"/>
-              </w:rPr>
-              <w:t xml:space="preserve"> Workstation &amp; Software (6.1–6.4)</w:t>
+              <w:t xml:space="preserve">รวม Workstation &amp; Software (6.1–6.5)</w:t>
             </w:r>
           </w:p>
         </w:tc>
@@ -13505,7 +13702,7 @@
                 <w:sz w:val="32"/>
                 <w:szCs w:val="32"/>
               </w:rPr>
-              <w:t>10,200,000</w:t>
+              <w:t xml:space="preserve">12,200,000</w:t>
             </w:r>
           </w:p>
         </w:tc>
@@ -15643,7 +15840,7 @@
                 <w:sz w:val="32"/>
                 <w:szCs w:val="32"/>
               </w:rPr>
-              <w:t xml:space="preserve">65,000,000</w:t>
+              <w:t xml:space="preserve">67,000,000</w:t>
             </w:r>
           </w:p>
         </w:tc>
@@ -15728,67 +15925,7 @@
                 <w:sz w:val="28"/>
                 <w:szCs w:val="28"/>
               </w:rPr>
-              <w:t xml:space="preserve">หมายเหตุ: | </w:t>
-            </w:r>
-            <w:r>
-              <w:rPr>
-                <w:b/>
-                <w:bCs/>
-                <w:color w:val="1A1A2E"/>
-                <w:sz w:val="28"/>
-                <w:szCs w:val="28"/>
-              </w:rPr>
-              <w:t xml:space="preserve">ปรับลด GPU Server H100 จาก 2 เครื่องเหลือ 1 เครื่อง และเพิ่ม Cloud GPU Credits 4.7 ล้านบาท (3 ปี) สำหรับ Burst Capacity เพื่อให้อยู่ในกรอบวงเงิน 65 ล้านบาท | </w:t>
-            </w:r>
-            <w:r>
-              <w:rPr>
-                <w:b/>
-                <w:bCs/>
-                <w:color w:val="1A1A2E"/>
-                <w:sz w:val="28"/>
-                <w:szCs w:val="28"/>
-              </w:rPr>
-              <w:t xml:space="preserve">สามารถจัดซื้อ H100 เครื่องที่ 2 ได้ในระยะที่ 2 เมื่อมีความต้องการที่ชัดเจนและงบประมาณเพิ่มเติม | </w:t>
-            </w:r>
-            <w:r>
-              <w:rPr>
-                <w:b/>
-                <w:bCs/>
-                <w:color w:val="1A1A2E"/>
-                <w:sz w:val="28"/>
-                <w:szCs w:val="28"/>
-              </w:rPr>
-              <w:t xml:space="preserve">Cloud GPU Credits (รายการ 4.4) จัดเป็นงบลงทุนเนื่องจากเป็น การจัดซื้อ Compute Resource Pool แบบจ่ายล่วงหน้า 3 ปี (Prepaid Credit) มีลักษณะคล้าย Perpetual License ไม่ใช่การเช่ารายเดือน | </w:t>
-            </w:r>
-            <w:r>
-              <w:rPr>
-                <w:b/>
-                <w:bCs/>
-                <w:color w:val="1A1A2E"/>
-                <w:sz w:val="28"/>
-                <w:szCs w:val="28"/>
-              </w:rPr>
-              <w:t xml:space="preserve">ค่าต่ออายุ License Software (NVIDIA AI Enterprise, MLOps) หลังปีที่ 3 ประมาณ 1,000,000 บาท/ปี จะจ่ายจากงบดำเนินการ | </w:t>
-            </w:r>
-            <w:r>
-              <w:rPr>
-                <w:b/>
-                <w:bCs/>
-                <w:color w:val="1A1A2E"/>
-                <w:sz w:val="28"/>
-                <w:szCs w:val="28"/>
-              </w:rPr>
-              <w:t xml:space="preserve">ค่าบำรุงรักษาและรับประกัน (Maintenance &amp; Extended Warranty) ปีที่ 1 อยู่ในเงื่อนไขรับประกันของผู้ผลิต ปีที่ 2–5 ประมาณ 10–12% ของมูลค่าครุภัณฑ์ต่อปี จะจ่ายจากงบดำเนินการ (ประมาณ 6–8 ล้านบาท/ปี) | </w:t>
-            </w:r>
-            <w:r>
-              <w:rPr>
-                <w:b/>
-                <w:bCs/>
-                <w:color w:val="1A1A2E"/>
-                <w:sz w:val="28"/>
-                <w:szCs w:val="28"/>
-              </w:rPr>
-              <w:t xml:space="preserve">ควรขอ Academic Discount จาก NVIDIA, Intel, AMD เนื่องจากโครงการวิจัยมหาวิทยาลัยมักได้รับส่วนลด 15–30%</w:t>
+              <w:t xml:space="preserve">หมายเหตุ: | ปรับลด GPU Server H100 จาก 2 เครื่องเหลือ 1 เครื่อง และเพิ่ม Cloud GPU Credits 4.7 ล้านบาท (3 ปี) สำหรับ Burst Capacity เพื่อให้อยู่ในกรอบวงเงินเดิม | เพิ่มรายการ 6.5 NVIDIA DGX Spark Desktop AI Workstation 10 เครื่อง สำหรับ Education Hub และ Startup Development (Grace Blackwell Superchip, 128 GB, 1 PFLOPS) | สามารถจัดซื้อ H100 เครื่องที่ 2 ได้ในปีที่ 3 จากงบขยายผล | วงเงินรวมหมวดที่ 2 ปรับจาก 65 ล้านบาท เป็น 67 ล้านบาท</w:t>
             </w:r>
           </w:p>
         </w:tc>
@@ -27432,6 +27569,1342 @@
         <w:tc>
           <w:tcPr>
             <w:tcW w:w="0" w:type="auto"/>
+            <w:tcBorders>
+              <w:top w:val="single" w:sz="1" w:space="0" w:color="B0C4DE"/>
+              <w:left w:val="single" w:sz="1" w:space="0" w:color="B0C4DE"/>
+              <w:bottom w:val="single" w:sz="1" w:space="0" w:color="B0C4DE"/>
+              <w:right w:val="single" w:sz="1" w:space="0" w:color="B0C4DE"/>
+            </w:tcBorders>
+            <w:shd w:val="clear" w:color="auto" w:fill="FFFFFF"/>
+            <w:tcMar>
+              <w:top w:w="70" w:type="dxa"/>
+              <w:left w:w="100" w:type="dxa"/>
+              <w:bottom w:w="70" w:type="dxa"/>
+              <w:right w:w="100" w:type="dxa"/>
+            </w:tcMar>
+          </w:tcPr>
+          <w:p>
+            <w:pPr>
+              <w:jc w:val="center"/>
+              <w:rPr>
+                <w:sz w:val="32"/>
+                <w:szCs w:val="32"/>
+              </w:rPr>
+            </w:pPr>
+            <w:r>
+              <w:rPr>
+                <w:color w:val="1A1A2E"/>
+                <w:sz w:val="32"/>
+                <w:szCs w:val="32"/>
+              </w:rPr>
+              <w:t xml:space="preserve">12.9</w:t>
+            </w:r>
+          </w:p>
+        </w:tc>
+        <w:tc>
+          <w:tcPr>
+            <w:tcW w:w="0" w:type="auto"/>
+            <w:tcBorders>
+              <w:top w:val="single" w:sz="1" w:space="0" w:color="B0C4DE"/>
+              <w:left w:val="single" w:sz="1" w:space="0" w:color="B0C4DE"/>
+              <w:bottom w:val="single" w:sz="1" w:space="0" w:color="B0C4DE"/>
+              <w:right w:val="single" w:sz="1" w:space="0" w:color="B0C4DE"/>
+            </w:tcBorders>
+            <w:shd w:val="clear" w:color="auto" w:fill="FFFFFF"/>
+            <w:tcMar>
+              <w:top w:w="70" w:type="dxa"/>
+              <w:left w:w="100" w:type="dxa"/>
+              <w:bottom w:w="70" w:type="dxa"/>
+              <w:right w:w="100" w:type="dxa"/>
+            </w:tcMar>
+          </w:tcPr>
+          <w:p>
+            <w:pPr>
+              <w:rPr>
+                <w:sz w:val="32"/>
+                <w:szCs w:val="32"/>
+              </w:rPr>
+            </w:pPr>
+            <w:proofErr w:type="spellStart"/>
+            <w:proofErr w:type="spellEnd"/>
+            <w:r>
+              <w:rPr>
+                <w:b/>
+                <w:bCs/>
+                <w:color w:val="1A1A2E"/>
+                <w:sz w:val="32"/>
+                <w:szCs w:val="32"/>
+              </w:rPr>
+              <w:t xml:space="preserve">Humanoid Robot — Research Grade (Unitree H1 หรือเทียบเท่า)</w:t>
+            </w:r>
+          </w:p>
+        </w:tc>
+        <w:tc>
+          <w:tcPr>
+            <w:tcW w:w="0" w:type="auto"/>
+            <w:tcBorders>
+              <w:top w:val="single" w:sz="1" w:space="0" w:color="B0C4DE"/>
+              <w:left w:val="single" w:sz="1" w:space="0" w:color="B0C4DE"/>
+              <w:bottom w:val="single" w:sz="1" w:space="0" w:color="B0C4DE"/>
+              <w:right w:val="single" w:sz="1" w:space="0" w:color="B0C4DE"/>
+            </w:tcBorders>
+            <w:shd w:val="clear" w:color="auto" w:fill="FFFFFF"/>
+            <w:tcMar>
+              <w:top w:w="70" w:type="dxa"/>
+              <w:left w:w="100" w:type="dxa"/>
+              <w:bottom w:w="70" w:type="dxa"/>
+              <w:right w:w="100" w:type="dxa"/>
+            </w:tcMar>
+          </w:tcPr>
+          <w:p>
+            <w:pPr>
+              <w:rPr>
+                <w:sz w:val="32"/>
+                <w:szCs w:val="32"/>
+              </w:rPr>
+            </w:pPr>
+            <w:proofErr w:type="spellStart"/>
+            <w:proofErr w:type="spellEnd"/>
+            <w:proofErr w:type="spellStart"/>
+            <w:proofErr w:type="spellEnd"/>
+            <w:r>
+              <w:rPr>
+                <w:color w:val="1A1A2E"/>
+                <w:sz w:val="32"/>
+                <w:szCs w:val="32"/>
+              </w:rPr>
+              <w:t xml:space="preserve">- Full-size Bipedal Humanoid, สูง ~180 cm, ~47 kg
+- ≥ 19 DoF, Walking speed ≤ 3.3 m/s
+- 3D LiDAR, Depth Camera, IMU
+- ROS2 Compatible, Python/C++ SDK
+- Battery ≥ 1 hr continuous operation
+- สำหรับวิจัย Locomotion, Manipulation, HRI</w:t>
+            </w:r>
+          </w:p>
+        </w:tc>
+        <w:tc>
+          <w:tcPr>
+            <w:tcW w:w="0" w:type="auto"/>
+            <w:tcBorders>
+              <w:top w:val="single" w:sz="1" w:space="0" w:color="B0C4DE"/>
+              <w:left w:val="single" w:sz="1" w:space="0" w:color="B0C4DE"/>
+              <w:bottom w:val="single" w:sz="1" w:space="0" w:color="B0C4DE"/>
+              <w:right w:val="single" w:sz="1" w:space="0" w:color="B0C4DE"/>
+            </w:tcBorders>
+            <w:shd w:val="clear" w:color="auto" w:fill="FFFFFF"/>
+            <w:tcMar>
+              <w:top w:w="70" w:type="dxa"/>
+              <w:left w:w="100" w:type="dxa"/>
+              <w:bottom w:w="70" w:type="dxa"/>
+              <w:right w:w="100" w:type="dxa"/>
+            </w:tcMar>
+          </w:tcPr>
+          <w:p>
+            <w:pPr>
+              <w:jc w:val="center"/>
+              <w:rPr>
+                <w:sz w:val="32"/>
+                <w:szCs w:val="32"/>
+              </w:rPr>
+            </w:pPr>
+            <w:r>
+              <w:rPr>
+                <w:color w:val="1A1A2E"/>
+                <w:sz w:val="32"/>
+                <w:szCs w:val="32"/>
+              </w:rPr>
+              <w:t xml:space="preserve">2</w:t>
+            </w:r>
+          </w:p>
+        </w:tc>
+        <w:tc>
+          <w:tcPr>
+            <w:tcW w:w="0" w:type="auto"/>
+            <w:tcBorders>
+              <w:top w:val="single" w:sz="1" w:space="0" w:color="B0C4DE"/>
+              <w:left w:val="single" w:sz="1" w:space="0" w:color="B0C4DE"/>
+              <w:bottom w:val="single" w:sz="1" w:space="0" w:color="B0C4DE"/>
+              <w:right w:val="single" w:sz="1" w:space="0" w:color="B0C4DE"/>
+            </w:tcBorders>
+            <w:shd w:val="clear" w:color="auto" w:fill="FFFFFF"/>
+            <w:tcMar>
+              <w:top w:w="70" w:type="dxa"/>
+              <w:left w:w="100" w:type="dxa"/>
+              <w:bottom w:w="70" w:type="dxa"/>
+              <w:right w:w="100" w:type="dxa"/>
+            </w:tcMar>
+          </w:tcPr>
+          <w:p>
+            <w:pPr>
+              <w:jc w:val="center"/>
+              <w:rPr>
+                <w:sz w:val="32"/>
+                <w:szCs w:val="32"/>
+              </w:rPr>
+            </w:pPr>
+            <w:proofErr w:type="spellStart"/>
+            <w:proofErr w:type="spellEnd"/>
+            <w:r>
+              <w:rPr>
+                <w:color w:val="1A1A2E"/>
+                <w:sz w:val="32"/>
+                <w:szCs w:val="32"/>
+              </w:rPr>
+              <w:t xml:space="preserve">ตัว</w:t>
+            </w:r>
+          </w:p>
+        </w:tc>
+        <w:tc>
+          <w:tcPr>
+            <w:tcW w:w="0" w:type="auto"/>
+            <w:tcBorders>
+              <w:top w:val="single" w:sz="1" w:space="0" w:color="B0C4DE"/>
+              <w:left w:val="single" w:sz="1" w:space="0" w:color="B0C4DE"/>
+              <w:bottom w:val="single" w:sz="1" w:space="0" w:color="B0C4DE"/>
+              <w:right w:val="single" w:sz="1" w:space="0" w:color="B0C4DE"/>
+            </w:tcBorders>
+            <w:shd w:val="clear" w:color="auto" w:fill="FFFFFF"/>
+            <w:tcMar>
+              <w:top w:w="70" w:type="dxa"/>
+              <w:left w:w="100" w:type="dxa"/>
+              <w:bottom w:w="70" w:type="dxa"/>
+              <w:right w:w="100" w:type="dxa"/>
+            </w:tcMar>
+          </w:tcPr>
+          <w:p>
+            <w:pPr>
+              <w:jc w:val="center"/>
+              <w:rPr>
+                <w:sz w:val="32"/>
+                <w:szCs w:val="32"/>
+              </w:rPr>
+            </w:pPr>
+            <w:r>
+              <w:rPr>
+                <w:color w:val="1A1A2E"/>
+                <w:sz w:val="32"/>
+                <w:szCs w:val="32"/>
+              </w:rPr>
+              <w:t xml:space="preserve">3,500,000</w:t>
+            </w:r>
+          </w:p>
+        </w:tc>
+        <w:tc>
+          <w:tcPr>
+            <w:tcW w:w="0" w:type="auto"/>
+            <w:tcBorders>
+              <w:top w:val="single" w:sz="1" w:space="0" w:color="B0C4DE"/>
+              <w:left w:val="single" w:sz="1" w:space="0" w:color="B0C4DE"/>
+              <w:bottom w:val="single" w:sz="1" w:space="0" w:color="B0C4DE"/>
+              <w:right w:val="single" w:sz="1" w:space="0" w:color="B0C4DE"/>
+            </w:tcBorders>
+            <w:shd w:val="clear" w:color="auto" w:fill="FFFFFF"/>
+            <w:tcMar>
+              <w:top w:w="70" w:type="dxa"/>
+              <w:left w:w="100" w:type="dxa"/>
+              <w:bottom w:w="70" w:type="dxa"/>
+              <w:right w:w="100" w:type="dxa"/>
+            </w:tcMar>
+          </w:tcPr>
+          <w:p>
+            <w:pPr>
+              <w:jc w:val="center"/>
+              <w:rPr>
+                <w:sz w:val="32"/>
+                <w:szCs w:val="32"/>
+              </w:rPr>
+            </w:pPr>
+            <w:r>
+              <w:rPr>
+                <w:b/>
+                <w:bCs/>
+                <w:color w:val="1A3A6B"/>
+                <w:sz w:val="32"/>
+                <w:szCs w:val="32"/>
+              </w:rPr>
+              <w:t xml:space="preserve">7,000,000</w:t>
+            </w:r>
+          </w:p>
+        </w:tc>
+      </w:tr>
+      <w:tr>
+        <w:tblPrEx>
+          <w:tblCellMar>
+            <w:top w:w="0" w:type="dxa"/>
+            <w:bottom w:w="0" w:type="dxa"/>
+          </w:tblCellMar>
+        </w:tblPrEx>
+        <w:tc>
+          <w:tcPr>
+            <w:tcW w:w="0" w:type="auto"/>
+            <w:tcBorders>
+              <w:top w:val="single" w:sz="1" w:space="0" w:color="B0C4DE"/>
+              <w:left w:val="single" w:sz="1" w:space="0" w:color="B0C4DE"/>
+              <w:bottom w:val="single" w:sz="1" w:space="0" w:color="B0C4DE"/>
+              <w:right w:val="single" w:sz="1" w:space="0" w:color="B0C4DE"/>
+            </w:tcBorders>
+            <w:shd w:val="clear" w:color="auto" w:fill="FFFFFF"/>
+            <w:tcMar>
+              <w:top w:w="70" w:type="dxa"/>
+              <w:left w:w="100" w:type="dxa"/>
+              <w:bottom w:w="70" w:type="dxa"/>
+              <w:right w:w="100" w:type="dxa"/>
+            </w:tcMar>
+          </w:tcPr>
+          <w:p>
+            <w:pPr>
+              <w:jc w:val="center"/>
+              <w:rPr>
+                <w:sz w:val="32"/>
+                <w:szCs w:val="32"/>
+              </w:rPr>
+            </w:pPr>
+            <w:r>
+              <w:rPr>
+                <w:color w:val="1A1A2E"/>
+                <w:sz w:val="32"/>
+                <w:szCs w:val="32"/>
+              </w:rPr>
+              <w:t xml:space="preserve">12.10</w:t>
+            </w:r>
+          </w:p>
+        </w:tc>
+        <w:tc>
+          <w:tcPr>
+            <w:tcW w:w="0" w:type="auto"/>
+            <w:tcBorders>
+              <w:top w:val="single" w:sz="1" w:space="0" w:color="B0C4DE"/>
+              <w:left w:val="single" w:sz="1" w:space="0" w:color="B0C4DE"/>
+              <w:bottom w:val="single" w:sz="1" w:space="0" w:color="B0C4DE"/>
+              <w:right w:val="single" w:sz="1" w:space="0" w:color="B0C4DE"/>
+            </w:tcBorders>
+            <w:shd w:val="clear" w:color="auto" w:fill="FFFFFF"/>
+            <w:tcMar>
+              <w:top w:w="70" w:type="dxa"/>
+              <w:left w:w="100" w:type="dxa"/>
+              <w:bottom w:w="70" w:type="dxa"/>
+              <w:right w:w="100" w:type="dxa"/>
+            </w:tcMar>
+          </w:tcPr>
+          <w:p>
+            <w:pPr>
+              <w:rPr>
+                <w:sz w:val="32"/>
+                <w:szCs w:val="32"/>
+              </w:rPr>
+            </w:pPr>
+            <w:proofErr w:type="spellStart"/>
+            <w:proofErr w:type="spellEnd"/>
+            <w:r>
+              <w:rPr>
+                <w:b/>
+                <w:bCs/>
+                <w:color w:val="1A1A2E"/>
+                <w:sz w:val="32"/>
+                <w:szCs w:val="32"/>
+              </w:rPr>
+              <w:t xml:space="preserve">Humanoid Robot — Healthcare (Fourier Intelligence GR-2 หรือเทียบเท่า)</w:t>
+            </w:r>
+          </w:p>
+        </w:tc>
+        <w:tc>
+          <w:tcPr>
+            <w:tcW w:w="0" w:type="auto"/>
+            <w:tcBorders>
+              <w:top w:val="single" w:sz="1" w:space="0" w:color="B0C4DE"/>
+              <w:left w:val="single" w:sz="1" w:space="0" w:color="B0C4DE"/>
+              <w:bottom w:val="single" w:sz="1" w:space="0" w:color="B0C4DE"/>
+              <w:right w:val="single" w:sz="1" w:space="0" w:color="B0C4DE"/>
+            </w:tcBorders>
+            <w:shd w:val="clear" w:color="auto" w:fill="FFFFFF"/>
+            <w:tcMar>
+              <w:top w:w="70" w:type="dxa"/>
+              <w:left w:w="100" w:type="dxa"/>
+              <w:bottom w:w="70" w:type="dxa"/>
+              <w:right w:w="100" w:type="dxa"/>
+            </w:tcMar>
+          </w:tcPr>
+          <w:p>
+            <w:pPr>
+              <w:rPr>
+                <w:sz w:val="32"/>
+                <w:szCs w:val="32"/>
+              </w:rPr>
+            </w:pPr>
+            <w:proofErr w:type="spellStart"/>
+            <w:proofErr w:type="spellEnd"/>
+            <w:proofErr w:type="spellStart"/>
+            <w:proofErr w:type="spellEnd"/>
+            <w:r>
+              <w:rPr>
+                <w:color w:val="1A1A2E"/>
+                <w:sz w:val="32"/>
+                <w:szCs w:val="32"/>
+              </w:rPr>
+              <w:t xml:space="preserve">- Healthcare Humanoid, สูง ~175 cm, ~55 kg
+- ≥ 53 DoF, Force-Torque Sensors ทุกข้อต่อ
+- Compliant Actuators สำหรับ Human Interaction
+- ROS2 Compatible, Motion Planning SDK
+- สำหรับวิจัย Healthcare, Rehabilitation, Elderly Care</w:t>
+            </w:r>
+          </w:p>
+        </w:tc>
+        <w:tc>
+          <w:tcPr>
+            <w:tcW w:w="0" w:type="auto"/>
+            <w:tcBorders>
+              <w:top w:val="single" w:sz="1" w:space="0" w:color="B0C4DE"/>
+              <w:left w:val="single" w:sz="1" w:space="0" w:color="B0C4DE"/>
+              <w:bottom w:val="single" w:sz="1" w:space="0" w:color="B0C4DE"/>
+              <w:right w:val="single" w:sz="1" w:space="0" w:color="B0C4DE"/>
+            </w:tcBorders>
+            <w:shd w:val="clear" w:color="auto" w:fill="FFFFFF"/>
+            <w:tcMar>
+              <w:top w:w="70" w:type="dxa"/>
+              <w:left w:w="100" w:type="dxa"/>
+              <w:bottom w:w="70" w:type="dxa"/>
+              <w:right w:w="100" w:type="dxa"/>
+            </w:tcMar>
+          </w:tcPr>
+          <w:p>
+            <w:pPr>
+              <w:jc w:val="center"/>
+              <w:rPr>
+                <w:sz w:val="32"/>
+                <w:szCs w:val="32"/>
+              </w:rPr>
+            </w:pPr>
+            <w:r>
+              <w:rPr>
+                <w:color w:val="1A1A2E"/>
+                <w:sz w:val="32"/>
+                <w:szCs w:val="32"/>
+              </w:rPr>
+              <w:t xml:space="preserve">1</w:t>
+            </w:r>
+          </w:p>
+        </w:tc>
+        <w:tc>
+          <w:tcPr>
+            <w:tcW w:w="0" w:type="auto"/>
+            <w:tcBorders>
+              <w:top w:val="single" w:sz="1" w:space="0" w:color="B0C4DE"/>
+              <w:left w:val="single" w:sz="1" w:space="0" w:color="B0C4DE"/>
+              <w:bottom w:val="single" w:sz="1" w:space="0" w:color="B0C4DE"/>
+              <w:right w:val="single" w:sz="1" w:space="0" w:color="B0C4DE"/>
+            </w:tcBorders>
+            <w:shd w:val="clear" w:color="auto" w:fill="FFFFFF"/>
+            <w:tcMar>
+              <w:top w:w="70" w:type="dxa"/>
+              <w:left w:w="100" w:type="dxa"/>
+              <w:bottom w:w="70" w:type="dxa"/>
+              <w:right w:w="100" w:type="dxa"/>
+            </w:tcMar>
+          </w:tcPr>
+          <w:p>
+            <w:pPr>
+              <w:jc w:val="center"/>
+              <w:rPr>
+                <w:sz w:val="32"/>
+                <w:szCs w:val="32"/>
+              </w:rPr>
+            </w:pPr>
+            <w:proofErr w:type="spellStart"/>
+            <w:proofErr w:type="spellEnd"/>
+            <w:r>
+              <w:rPr>
+                <w:color w:val="1A1A2E"/>
+                <w:sz w:val="32"/>
+                <w:szCs w:val="32"/>
+              </w:rPr>
+              <w:t xml:space="preserve">ตัว</w:t>
+            </w:r>
+          </w:p>
+        </w:tc>
+        <w:tc>
+          <w:tcPr>
+            <w:tcW w:w="0" w:type="auto"/>
+            <w:tcBorders>
+              <w:top w:val="single" w:sz="1" w:space="0" w:color="B0C4DE"/>
+              <w:left w:val="single" w:sz="1" w:space="0" w:color="B0C4DE"/>
+              <w:bottom w:val="single" w:sz="1" w:space="0" w:color="B0C4DE"/>
+              <w:right w:val="single" w:sz="1" w:space="0" w:color="B0C4DE"/>
+            </w:tcBorders>
+            <w:shd w:val="clear" w:color="auto" w:fill="FFFFFF"/>
+            <w:tcMar>
+              <w:top w:w="70" w:type="dxa"/>
+              <w:left w:w="100" w:type="dxa"/>
+              <w:bottom w:w="70" w:type="dxa"/>
+              <w:right w:w="100" w:type="dxa"/>
+            </w:tcMar>
+          </w:tcPr>
+          <w:p>
+            <w:pPr>
+              <w:jc w:val="center"/>
+              <w:rPr>
+                <w:sz w:val="32"/>
+                <w:szCs w:val="32"/>
+              </w:rPr>
+            </w:pPr>
+            <w:r>
+              <w:rPr>
+                <w:color w:val="1A1A2E"/>
+                <w:sz w:val="32"/>
+                <w:szCs w:val="32"/>
+              </w:rPr>
+              <w:t xml:space="preserve">3,500,000</w:t>
+            </w:r>
+          </w:p>
+        </w:tc>
+        <w:tc>
+          <w:tcPr>
+            <w:tcW w:w="0" w:type="auto"/>
+            <w:tcBorders>
+              <w:top w:val="single" w:sz="1" w:space="0" w:color="B0C4DE"/>
+              <w:left w:val="single" w:sz="1" w:space="0" w:color="B0C4DE"/>
+              <w:bottom w:val="single" w:sz="1" w:space="0" w:color="B0C4DE"/>
+              <w:right w:val="single" w:sz="1" w:space="0" w:color="B0C4DE"/>
+            </w:tcBorders>
+            <w:shd w:val="clear" w:color="auto" w:fill="FFFFFF"/>
+            <w:tcMar>
+              <w:top w:w="70" w:type="dxa"/>
+              <w:left w:w="100" w:type="dxa"/>
+              <w:bottom w:w="70" w:type="dxa"/>
+              <w:right w:w="100" w:type="dxa"/>
+            </w:tcMar>
+          </w:tcPr>
+          <w:p>
+            <w:pPr>
+              <w:jc w:val="center"/>
+              <w:rPr>
+                <w:sz w:val="32"/>
+                <w:szCs w:val="32"/>
+              </w:rPr>
+            </w:pPr>
+            <w:r>
+              <w:rPr>
+                <w:b/>
+                <w:bCs/>
+                <w:color w:val="1A3A6B"/>
+                <w:sz w:val="32"/>
+                <w:szCs w:val="32"/>
+              </w:rPr>
+              <w:t xml:space="preserve">3,500,000</w:t>
+            </w:r>
+          </w:p>
+        </w:tc>
+      </w:tr>
+      <w:tr>
+        <w:tblPrEx>
+          <w:tblCellMar>
+            <w:top w:w="0" w:type="dxa"/>
+            <w:bottom w:w="0" w:type="dxa"/>
+          </w:tblCellMar>
+        </w:tblPrEx>
+        <w:tc>
+          <w:tcPr>
+            <w:tcW w:w="0" w:type="auto"/>
+            <w:tcBorders>
+              <w:top w:val="single" w:sz="1" w:space="0" w:color="B0C4DE"/>
+              <w:left w:val="single" w:sz="1" w:space="0" w:color="B0C4DE"/>
+              <w:bottom w:val="single" w:sz="1" w:space="0" w:color="B0C4DE"/>
+              <w:right w:val="single" w:sz="1" w:space="0" w:color="B0C4DE"/>
+            </w:tcBorders>
+            <w:shd w:val="clear" w:color="auto" w:fill="FFFFFF"/>
+            <w:tcMar>
+              <w:top w:w="70" w:type="dxa"/>
+              <w:left w:w="100" w:type="dxa"/>
+              <w:bottom w:w="70" w:type="dxa"/>
+              <w:right w:w="100" w:type="dxa"/>
+            </w:tcMar>
+          </w:tcPr>
+          <w:p>
+            <w:pPr>
+              <w:jc w:val="center"/>
+              <w:rPr>
+                <w:sz w:val="32"/>
+                <w:szCs w:val="32"/>
+              </w:rPr>
+            </w:pPr>
+            <w:r>
+              <w:rPr>
+                <w:color w:val="1A1A2E"/>
+                <w:sz w:val="32"/>
+                <w:szCs w:val="32"/>
+              </w:rPr>
+              <w:t xml:space="preserve">12.11</w:t>
+            </w:r>
+          </w:p>
+        </w:tc>
+        <w:tc>
+          <w:tcPr>
+            <w:tcW w:w="0" w:type="auto"/>
+            <w:tcBorders>
+              <w:top w:val="single" w:sz="1" w:space="0" w:color="B0C4DE"/>
+              <w:left w:val="single" w:sz="1" w:space="0" w:color="B0C4DE"/>
+              <w:bottom w:val="single" w:sz="1" w:space="0" w:color="B0C4DE"/>
+              <w:right w:val="single" w:sz="1" w:space="0" w:color="B0C4DE"/>
+            </w:tcBorders>
+            <w:shd w:val="clear" w:color="auto" w:fill="FFFFFF"/>
+            <w:tcMar>
+              <w:top w:w="70" w:type="dxa"/>
+              <w:left w:w="100" w:type="dxa"/>
+              <w:bottom w:w="70" w:type="dxa"/>
+              <w:right w:w="100" w:type="dxa"/>
+            </w:tcMar>
+          </w:tcPr>
+          <w:p>
+            <w:pPr>
+              <w:rPr>
+                <w:sz w:val="32"/>
+                <w:szCs w:val="32"/>
+              </w:rPr>
+            </w:pPr>
+            <w:proofErr w:type="spellStart"/>
+            <w:proofErr w:type="spellEnd"/>
+            <w:r>
+              <w:rPr>
+                <w:b/>
+                <w:bCs/>
+                <w:color w:val="1A1A2E"/>
+                <w:sz w:val="32"/>
+                <w:szCs w:val="32"/>
+              </w:rPr>
+              <w:t xml:space="preserve">Humanoid Robot — Service (UBTECH Walker S หรือเทียบเท่า)</w:t>
+            </w:r>
+          </w:p>
+        </w:tc>
+        <w:tc>
+          <w:tcPr>
+            <w:tcW w:w="0" w:type="auto"/>
+            <w:tcBorders>
+              <w:top w:val="single" w:sz="1" w:space="0" w:color="B0C4DE"/>
+              <w:left w:val="single" w:sz="1" w:space="0" w:color="B0C4DE"/>
+              <w:bottom w:val="single" w:sz="1" w:space="0" w:color="B0C4DE"/>
+              <w:right w:val="single" w:sz="1" w:space="0" w:color="B0C4DE"/>
+            </w:tcBorders>
+            <w:shd w:val="clear" w:color="auto" w:fill="FFFFFF"/>
+            <w:tcMar>
+              <w:top w:w="70" w:type="dxa"/>
+              <w:left w:w="100" w:type="dxa"/>
+              <w:bottom w:w="70" w:type="dxa"/>
+              <w:right w:w="100" w:type="dxa"/>
+            </w:tcMar>
+          </w:tcPr>
+          <w:p>
+            <w:pPr>
+              <w:rPr>
+                <w:sz w:val="32"/>
+                <w:szCs w:val="32"/>
+              </w:rPr>
+            </w:pPr>
+            <w:proofErr w:type="spellStart"/>
+            <w:proofErr w:type="spellEnd"/>
+            <w:proofErr w:type="spellStart"/>
+            <w:proofErr w:type="spellEnd"/>
+            <w:r>
+              <w:rPr>
+                <w:color w:val="1A1A2E"/>
+                <w:sz w:val="32"/>
+                <w:szCs w:val="32"/>
+              </w:rPr>
+              <w:t xml:space="preserve">- Service Humanoid, สูง ~150 cm, ~77 kg
+- ≥ 41 DoF, Dual-arm Manipulation
+- Visual SLAM, Face Recognition, NLP
+- Cloud AI Integration, Multi-language
+- สำหรับ Service Robotics, Hospitality, Customer Service</w:t>
+            </w:r>
+          </w:p>
+        </w:tc>
+        <w:tc>
+          <w:tcPr>
+            <w:tcW w:w="0" w:type="auto"/>
+            <w:tcBorders>
+              <w:top w:val="single" w:sz="1" w:space="0" w:color="B0C4DE"/>
+              <w:left w:val="single" w:sz="1" w:space="0" w:color="B0C4DE"/>
+              <w:bottom w:val="single" w:sz="1" w:space="0" w:color="B0C4DE"/>
+              <w:right w:val="single" w:sz="1" w:space="0" w:color="B0C4DE"/>
+            </w:tcBorders>
+            <w:shd w:val="clear" w:color="auto" w:fill="FFFFFF"/>
+            <w:tcMar>
+              <w:top w:w="70" w:type="dxa"/>
+              <w:left w:w="100" w:type="dxa"/>
+              <w:bottom w:w="70" w:type="dxa"/>
+              <w:right w:w="100" w:type="dxa"/>
+            </w:tcMar>
+          </w:tcPr>
+          <w:p>
+            <w:pPr>
+              <w:jc w:val="center"/>
+              <w:rPr>
+                <w:sz w:val="32"/>
+                <w:szCs w:val="32"/>
+              </w:rPr>
+            </w:pPr>
+            <w:r>
+              <w:rPr>
+                <w:color w:val="1A1A2E"/>
+                <w:sz w:val="32"/>
+                <w:szCs w:val="32"/>
+              </w:rPr>
+              <w:t xml:space="preserve">1</w:t>
+            </w:r>
+          </w:p>
+        </w:tc>
+        <w:tc>
+          <w:tcPr>
+            <w:tcW w:w="0" w:type="auto"/>
+            <w:tcBorders>
+              <w:top w:val="single" w:sz="1" w:space="0" w:color="B0C4DE"/>
+              <w:left w:val="single" w:sz="1" w:space="0" w:color="B0C4DE"/>
+              <w:bottom w:val="single" w:sz="1" w:space="0" w:color="B0C4DE"/>
+              <w:right w:val="single" w:sz="1" w:space="0" w:color="B0C4DE"/>
+            </w:tcBorders>
+            <w:shd w:val="clear" w:color="auto" w:fill="FFFFFF"/>
+            <w:tcMar>
+              <w:top w:w="70" w:type="dxa"/>
+              <w:left w:w="100" w:type="dxa"/>
+              <w:bottom w:w="70" w:type="dxa"/>
+              <w:right w:w="100" w:type="dxa"/>
+            </w:tcMar>
+          </w:tcPr>
+          <w:p>
+            <w:pPr>
+              <w:jc w:val="center"/>
+              <w:rPr>
+                <w:sz w:val="32"/>
+                <w:szCs w:val="32"/>
+              </w:rPr>
+            </w:pPr>
+            <w:proofErr w:type="spellStart"/>
+            <w:proofErr w:type="spellEnd"/>
+            <w:r>
+              <w:rPr>
+                <w:color w:val="1A1A2E"/>
+                <w:sz w:val="32"/>
+                <w:szCs w:val="32"/>
+              </w:rPr>
+              <w:t xml:space="preserve">ตัว</w:t>
+            </w:r>
+          </w:p>
+        </w:tc>
+        <w:tc>
+          <w:tcPr>
+            <w:tcW w:w="0" w:type="auto"/>
+            <w:tcBorders>
+              <w:top w:val="single" w:sz="1" w:space="0" w:color="B0C4DE"/>
+              <w:left w:val="single" w:sz="1" w:space="0" w:color="B0C4DE"/>
+              <w:bottom w:val="single" w:sz="1" w:space="0" w:color="B0C4DE"/>
+              <w:right w:val="single" w:sz="1" w:space="0" w:color="B0C4DE"/>
+            </w:tcBorders>
+            <w:shd w:val="clear" w:color="auto" w:fill="FFFFFF"/>
+            <w:tcMar>
+              <w:top w:w="70" w:type="dxa"/>
+              <w:left w:w="100" w:type="dxa"/>
+              <w:bottom w:w="70" w:type="dxa"/>
+              <w:right w:w="100" w:type="dxa"/>
+            </w:tcMar>
+          </w:tcPr>
+          <w:p>
+            <w:pPr>
+              <w:jc w:val="center"/>
+              <w:rPr>
+                <w:sz w:val="32"/>
+                <w:szCs w:val="32"/>
+              </w:rPr>
+            </w:pPr>
+            <w:r>
+              <w:rPr>
+                <w:color w:val="1A1A2E"/>
+                <w:sz w:val="32"/>
+                <w:szCs w:val="32"/>
+              </w:rPr>
+              <w:t xml:space="preserve">2,500,000</w:t>
+            </w:r>
+          </w:p>
+        </w:tc>
+        <w:tc>
+          <w:tcPr>
+            <w:tcW w:w="0" w:type="auto"/>
+            <w:tcBorders>
+              <w:top w:val="single" w:sz="1" w:space="0" w:color="B0C4DE"/>
+              <w:left w:val="single" w:sz="1" w:space="0" w:color="B0C4DE"/>
+              <w:bottom w:val="single" w:sz="1" w:space="0" w:color="B0C4DE"/>
+              <w:right w:val="single" w:sz="1" w:space="0" w:color="B0C4DE"/>
+            </w:tcBorders>
+            <w:shd w:val="clear" w:color="auto" w:fill="FFFFFF"/>
+            <w:tcMar>
+              <w:top w:w="70" w:type="dxa"/>
+              <w:left w:w="100" w:type="dxa"/>
+              <w:bottom w:w="70" w:type="dxa"/>
+              <w:right w:w="100" w:type="dxa"/>
+            </w:tcMar>
+          </w:tcPr>
+          <w:p>
+            <w:pPr>
+              <w:jc w:val="center"/>
+              <w:rPr>
+                <w:sz w:val="32"/>
+                <w:szCs w:val="32"/>
+              </w:rPr>
+            </w:pPr>
+            <w:r>
+              <w:rPr>
+                <w:b/>
+                <w:bCs/>
+                <w:color w:val="1A3A6B"/>
+                <w:sz w:val="32"/>
+                <w:szCs w:val="32"/>
+              </w:rPr>
+              <w:t xml:space="preserve">2,500,000</w:t>
+            </w:r>
+          </w:p>
+        </w:tc>
+      </w:tr>
+      <w:tr>
+        <w:tblPrEx>
+          <w:tblCellMar>
+            <w:top w:w="0" w:type="dxa"/>
+            <w:bottom w:w="0" w:type="dxa"/>
+          </w:tblCellMar>
+        </w:tblPrEx>
+        <w:tc>
+          <w:tcPr>
+            <w:tcW w:w="0" w:type="auto"/>
+            <w:tcBorders>
+              <w:top w:val="single" w:sz="1" w:space="0" w:color="B0C4DE"/>
+              <w:left w:val="single" w:sz="1" w:space="0" w:color="B0C4DE"/>
+              <w:bottom w:val="single" w:sz="1" w:space="0" w:color="B0C4DE"/>
+              <w:right w:val="single" w:sz="1" w:space="0" w:color="B0C4DE"/>
+            </w:tcBorders>
+            <w:shd w:val="clear" w:color="auto" w:fill="FFFFFF"/>
+            <w:tcMar>
+              <w:top w:w="70" w:type="dxa"/>
+              <w:left w:w="100" w:type="dxa"/>
+              <w:bottom w:w="70" w:type="dxa"/>
+              <w:right w:w="100" w:type="dxa"/>
+            </w:tcMar>
+          </w:tcPr>
+          <w:p>
+            <w:pPr>
+              <w:jc w:val="center"/>
+              <w:rPr>
+                <w:sz w:val="32"/>
+                <w:szCs w:val="32"/>
+              </w:rPr>
+            </w:pPr>
+            <w:r>
+              <w:rPr>
+                <w:color w:val="1A1A2E"/>
+                <w:sz w:val="32"/>
+                <w:szCs w:val="32"/>
+              </w:rPr>
+              <w:t xml:space="preserve">12.12</w:t>
+            </w:r>
+          </w:p>
+        </w:tc>
+        <w:tc>
+          <w:tcPr>
+            <w:tcW w:w="0" w:type="auto"/>
+            <w:tcBorders>
+              <w:top w:val="single" w:sz="1" w:space="0" w:color="B0C4DE"/>
+              <w:left w:val="single" w:sz="1" w:space="0" w:color="B0C4DE"/>
+              <w:bottom w:val="single" w:sz="1" w:space="0" w:color="B0C4DE"/>
+              <w:right w:val="single" w:sz="1" w:space="0" w:color="B0C4DE"/>
+            </w:tcBorders>
+            <w:shd w:val="clear" w:color="auto" w:fill="FFFFFF"/>
+            <w:tcMar>
+              <w:top w:w="70" w:type="dxa"/>
+              <w:left w:w="100" w:type="dxa"/>
+              <w:bottom w:w="70" w:type="dxa"/>
+              <w:right w:w="100" w:type="dxa"/>
+            </w:tcMar>
+          </w:tcPr>
+          <w:p>
+            <w:pPr>
+              <w:rPr>
+                <w:sz w:val="32"/>
+                <w:szCs w:val="32"/>
+              </w:rPr>
+            </w:pPr>
+            <w:proofErr w:type="spellStart"/>
+            <w:proofErr w:type="spellEnd"/>
+            <w:r>
+              <w:rPr>
+                <w:b/>
+                <w:bCs/>
+                <w:color w:val="1A1A2E"/>
+                <w:sz w:val="32"/>
+                <w:szCs w:val="32"/>
+              </w:rPr>
+              <w:t xml:space="preserve">Humanoid Robot — Industrial (Kepler Forerunner K2 หรือเทียบเท่า)</w:t>
+            </w:r>
+          </w:p>
+        </w:tc>
+        <w:tc>
+          <w:tcPr>
+            <w:tcW w:w="0" w:type="auto"/>
+            <w:tcBorders>
+              <w:top w:val="single" w:sz="1" w:space="0" w:color="B0C4DE"/>
+              <w:left w:val="single" w:sz="1" w:space="0" w:color="B0C4DE"/>
+              <w:bottom w:val="single" w:sz="1" w:space="0" w:color="B0C4DE"/>
+              <w:right w:val="single" w:sz="1" w:space="0" w:color="B0C4DE"/>
+            </w:tcBorders>
+            <w:shd w:val="clear" w:color="auto" w:fill="FFFFFF"/>
+            <w:tcMar>
+              <w:top w:w="70" w:type="dxa"/>
+              <w:left w:w="100" w:type="dxa"/>
+              <w:bottom w:w="70" w:type="dxa"/>
+              <w:right w:w="100" w:type="dxa"/>
+            </w:tcMar>
+          </w:tcPr>
+          <w:p>
+            <w:pPr>
+              <w:rPr>
+                <w:sz w:val="32"/>
+                <w:szCs w:val="32"/>
+              </w:rPr>
+            </w:pPr>
+            <w:proofErr w:type="spellStart"/>
+            <w:proofErr w:type="spellEnd"/>
+            <w:proofErr w:type="spellStart"/>
+            <w:proofErr w:type="spellEnd"/>
+            <w:r>
+              <w:rPr>
+                <w:color w:val="1A1A2E"/>
+                <w:sz w:val="32"/>
+                <w:szCs w:val="32"/>
+              </w:rPr>
+              <w:t xml:space="preserve">- Industrial Humanoid, สูง ~178 cm, ~85 kg
+- ≥ 40 DoF, Payload ≥ 15 kg per arm
+- High-Torque Actuators, Dexterous Hands
+- ROS2 Compatible, Industrial Communication
+- สำหรับ Industrial Automation, Manufacturing, Logistics</w:t>
+            </w:r>
+          </w:p>
+        </w:tc>
+        <w:tc>
+          <w:tcPr>
+            <w:tcW w:w="0" w:type="auto"/>
+            <w:tcBorders>
+              <w:top w:val="single" w:sz="1" w:space="0" w:color="B0C4DE"/>
+              <w:left w:val="single" w:sz="1" w:space="0" w:color="B0C4DE"/>
+              <w:bottom w:val="single" w:sz="1" w:space="0" w:color="B0C4DE"/>
+              <w:right w:val="single" w:sz="1" w:space="0" w:color="B0C4DE"/>
+            </w:tcBorders>
+            <w:shd w:val="clear" w:color="auto" w:fill="FFFFFF"/>
+            <w:tcMar>
+              <w:top w:w="70" w:type="dxa"/>
+              <w:left w:w="100" w:type="dxa"/>
+              <w:bottom w:w="70" w:type="dxa"/>
+              <w:right w:w="100" w:type="dxa"/>
+            </w:tcMar>
+          </w:tcPr>
+          <w:p>
+            <w:pPr>
+              <w:jc w:val="center"/>
+              <w:rPr>
+                <w:sz w:val="32"/>
+                <w:szCs w:val="32"/>
+              </w:rPr>
+            </w:pPr>
+            <w:r>
+              <w:rPr>
+                <w:color w:val="1A1A2E"/>
+                <w:sz w:val="32"/>
+                <w:szCs w:val="32"/>
+              </w:rPr>
+              <w:t xml:space="preserve">1</w:t>
+            </w:r>
+          </w:p>
+        </w:tc>
+        <w:tc>
+          <w:tcPr>
+            <w:tcW w:w="0" w:type="auto"/>
+            <w:tcBorders>
+              <w:top w:val="single" w:sz="1" w:space="0" w:color="B0C4DE"/>
+              <w:left w:val="single" w:sz="1" w:space="0" w:color="B0C4DE"/>
+              <w:bottom w:val="single" w:sz="1" w:space="0" w:color="B0C4DE"/>
+              <w:right w:val="single" w:sz="1" w:space="0" w:color="B0C4DE"/>
+            </w:tcBorders>
+            <w:shd w:val="clear" w:color="auto" w:fill="FFFFFF"/>
+            <w:tcMar>
+              <w:top w:w="70" w:type="dxa"/>
+              <w:left w:w="100" w:type="dxa"/>
+              <w:bottom w:w="70" w:type="dxa"/>
+              <w:right w:w="100" w:type="dxa"/>
+            </w:tcMar>
+          </w:tcPr>
+          <w:p>
+            <w:pPr>
+              <w:jc w:val="center"/>
+              <w:rPr>
+                <w:sz w:val="32"/>
+                <w:szCs w:val="32"/>
+              </w:rPr>
+            </w:pPr>
+            <w:proofErr w:type="spellStart"/>
+            <w:proofErr w:type="spellEnd"/>
+            <w:r>
+              <w:rPr>
+                <w:color w:val="1A1A2E"/>
+                <w:sz w:val="32"/>
+                <w:szCs w:val="32"/>
+              </w:rPr>
+              <w:t xml:space="preserve">ตัว</w:t>
+            </w:r>
+          </w:p>
+        </w:tc>
+        <w:tc>
+          <w:tcPr>
+            <w:tcW w:w="0" w:type="auto"/>
+            <w:tcBorders>
+              <w:top w:val="single" w:sz="1" w:space="0" w:color="B0C4DE"/>
+              <w:left w:val="single" w:sz="1" w:space="0" w:color="B0C4DE"/>
+              <w:bottom w:val="single" w:sz="1" w:space="0" w:color="B0C4DE"/>
+              <w:right w:val="single" w:sz="1" w:space="0" w:color="B0C4DE"/>
+            </w:tcBorders>
+            <w:shd w:val="clear" w:color="auto" w:fill="FFFFFF"/>
+            <w:tcMar>
+              <w:top w:w="70" w:type="dxa"/>
+              <w:left w:w="100" w:type="dxa"/>
+              <w:bottom w:w="70" w:type="dxa"/>
+              <w:right w:w="100" w:type="dxa"/>
+            </w:tcMar>
+          </w:tcPr>
+          <w:p>
+            <w:pPr>
+              <w:jc w:val="center"/>
+              <w:rPr>
+                <w:sz w:val="32"/>
+                <w:szCs w:val="32"/>
+              </w:rPr>
+            </w:pPr>
+            <w:r>
+              <w:rPr>
+                <w:color w:val="1A1A2E"/>
+                <w:sz w:val="32"/>
+                <w:szCs w:val="32"/>
+              </w:rPr>
+              <w:t xml:space="preserve">3,000,000</w:t>
+            </w:r>
+          </w:p>
+        </w:tc>
+        <w:tc>
+          <w:tcPr>
+            <w:tcW w:w="0" w:type="auto"/>
+            <w:tcBorders>
+              <w:top w:val="single" w:sz="1" w:space="0" w:color="B0C4DE"/>
+              <w:left w:val="single" w:sz="1" w:space="0" w:color="B0C4DE"/>
+              <w:bottom w:val="single" w:sz="1" w:space="0" w:color="B0C4DE"/>
+              <w:right w:val="single" w:sz="1" w:space="0" w:color="B0C4DE"/>
+            </w:tcBorders>
+            <w:shd w:val="clear" w:color="auto" w:fill="FFFFFF"/>
+            <w:tcMar>
+              <w:top w:w="70" w:type="dxa"/>
+              <w:left w:w="100" w:type="dxa"/>
+              <w:bottom w:w="70" w:type="dxa"/>
+              <w:right w:w="100" w:type="dxa"/>
+            </w:tcMar>
+          </w:tcPr>
+          <w:p>
+            <w:pPr>
+              <w:jc w:val="center"/>
+              <w:rPr>
+                <w:sz w:val="32"/>
+                <w:szCs w:val="32"/>
+              </w:rPr>
+            </w:pPr>
+            <w:r>
+              <w:rPr>
+                <w:b/>
+                <w:bCs/>
+                <w:color w:val="1A3A6B"/>
+                <w:sz w:val="32"/>
+                <w:szCs w:val="32"/>
+              </w:rPr>
+              <w:t xml:space="preserve">3,000,000</w:t>
+            </w:r>
+          </w:p>
+        </w:tc>
+      </w:tr>
+      <w:tr>
+        <w:tblPrEx>
+          <w:tblCellMar>
+            <w:top w:w="0" w:type="dxa"/>
+            <w:bottom w:w="0" w:type="dxa"/>
+          </w:tblCellMar>
+        </w:tblPrEx>
+        <w:tc>
+          <w:tcPr>
+            <w:tcW w:w="0" w:type="auto"/>
+            <w:tcBorders>
+              <w:top w:val="single" w:sz="1" w:space="0" w:color="B0C4DE"/>
+              <w:left w:val="single" w:sz="1" w:space="0" w:color="B0C4DE"/>
+              <w:bottom w:val="single" w:sz="1" w:space="0" w:color="B0C4DE"/>
+              <w:right w:val="single" w:sz="1" w:space="0" w:color="B0C4DE"/>
+            </w:tcBorders>
+            <w:shd w:val="clear" w:color="auto" w:fill="FFFFFF"/>
+            <w:tcMar>
+              <w:top w:w="70" w:type="dxa"/>
+              <w:left w:w="100" w:type="dxa"/>
+              <w:bottom w:w="70" w:type="dxa"/>
+              <w:right w:w="100" w:type="dxa"/>
+            </w:tcMar>
+          </w:tcPr>
+          <w:p>
+            <w:pPr>
+              <w:jc w:val="center"/>
+              <w:rPr>
+                <w:sz w:val="32"/>
+                <w:szCs w:val="32"/>
+              </w:rPr>
+            </w:pPr>
+            <w:r>
+              <w:rPr>
+                <w:color w:val="1A1A2E"/>
+                <w:sz w:val="32"/>
+                <w:szCs w:val="32"/>
+              </w:rPr>
+              <w:t xml:space="preserve">12.13</w:t>
+            </w:r>
+          </w:p>
+        </w:tc>
+        <w:tc>
+          <w:tcPr>
+            <w:tcW w:w="0" w:type="auto"/>
+            <w:tcBorders>
+              <w:top w:val="single" w:sz="1" w:space="0" w:color="B0C4DE"/>
+              <w:left w:val="single" w:sz="1" w:space="0" w:color="B0C4DE"/>
+              <w:bottom w:val="single" w:sz="1" w:space="0" w:color="B0C4DE"/>
+              <w:right w:val="single" w:sz="1" w:space="0" w:color="B0C4DE"/>
+            </w:tcBorders>
+            <w:shd w:val="clear" w:color="auto" w:fill="FFFFFF"/>
+            <w:tcMar>
+              <w:top w:w="70" w:type="dxa"/>
+              <w:left w:w="100" w:type="dxa"/>
+              <w:bottom w:w="70" w:type="dxa"/>
+              <w:right w:w="100" w:type="dxa"/>
+            </w:tcMar>
+          </w:tcPr>
+          <w:p>
+            <w:pPr>
+              <w:rPr>
+                <w:sz w:val="32"/>
+                <w:szCs w:val="32"/>
+              </w:rPr>
+            </w:pPr>
+            <w:proofErr w:type="spellStart"/>
+            <w:proofErr w:type="spellEnd"/>
+            <w:r>
+              <w:rPr>
+                <w:b/>
+                <w:bCs/>
+                <w:color w:val="1A1A2E"/>
+                <w:sz w:val="32"/>
+                <w:szCs w:val="32"/>
+              </w:rPr>
+              <w:t xml:space="preserve">Humanoid Robot Development Kit &amp; Accessories</w:t>
+            </w:r>
+          </w:p>
+        </w:tc>
+        <w:tc>
+          <w:tcPr>
+            <w:tcW w:w="0" w:type="auto"/>
+            <w:tcBorders>
+              <w:top w:val="single" w:sz="1" w:space="0" w:color="B0C4DE"/>
+              <w:left w:val="single" w:sz="1" w:space="0" w:color="B0C4DE"/>
+              <w:bottom w:val="single" w:sz="1" w:space="0" w:color="B0C4DE"/>
+              <w:right w:val="single" w:sz="1" w:space="0" w:color="B0C4DE"/>
+            </w:tcBorders>
+            <w:shd w:val="clear" w:color="auto" w:fill="FFFFFF"/>
+            <w:tcMar>
+              <w:top w:w="70" w:type="dxa"/>
+              <w:left w:w="100" w:type="dxa"/>
+              <w:bottom w:w="70" w:type="dxa"/>
+              <w:right w:w="100" w:type="dxa"/>
+            </w:tcMar>
+          </w:tcPr>
+          <w:p>
+            <w:pPr>
+              <w:rPr>
+                <w:sz w:val="32"/>
+                <w:szCs w:val="32"/>
+              </w:rPr>
+            </w:pPr>
+            <w:proofErr w:type="spellStart"/>
+            <w:proofErr w:type="spellEnd"/>
+            <w:proofErr w:type="spellStart"/>
+            <w:proofErr w:type="spellEnd"/>
+            <w:r>
+              <w:rPr>
+                <w:color w:val="1A1A2E"/>
+                <w:sz w:val="32"/>
+                <w:szCs w:val="32"/>
+              </w:rPr>
+              <w:t xml:space="preserve">- ชุดอะไหล่และอุปกรณ์สำรอง (Battery, Actuator, Sensor)
+- Charging Station &amp; Battery Management System
+- Motion Capture Marker Set สำหรับ Humanoid
+- Maintenance Tools &amp; Calibration Equipment
+- Training &amp; Documentation Package</w:t>
+            </w:r>
+          </w:p>
+        </w:tc>
+        <w:tc>
+          <w:tcPr>
+            <w:tcW w:w="0" w:type="auto"/>
+            <w:tcBorders>
+              <w:top w:val="single" w:sz="1" w:space="0" w:color="B0C4DE"/>
+              <w:left w:val="single" w:sz="1" w:space="0" w:color="B0C4DE"/>
+              <w:bottom w:val="single" w:sz="1" w:space="0" w:color="B0C4DE"/>
+              <w:right w:val="single" w:sz="1" w:space="0" w:color="B0C4DE"/>
+            </w:tcBorders>
+            <w:shd w:val="clear" w:color="auto" w:fill="FFFFFF"/>
+            <w:tcMar>
+              <w:top w:w="70" w:type="dxa"/>
+              <w:left w:w="100" w:type="dxa"/>
+              <w:bottom w:w="70" w:type="dxa"/>
+              <w:right w:w="100" w:type="dxa"/>
+            </w:tcMar>
+          </w:tcPr>
+          <w:p>
+            <w:pPr>
+              <w:jc w:val="center"/>
+              <w:rPr>
+                <w:sz w:val="32"/>
+                <w:szCs w:val="32"/>
+              </w:rPr>
+            </w:pPr>
+            <w:r>
+              <w:rPr>
+                <w:color w:val="1A1A2E"/>
+                <w:sz w:val="32"/>
+                <w:szCs w:val="32"/>
+              </w:rPr>
+              <w:t xml:space="preserve">1</w:t>
+            </w:r>
+          </w:p>
+        </w:tc>
+        <w:tc>
+          <w:tcPr>
+            <w:tcW w:w="0" w:type="auto"/>
+            <w:tcBorders>
+              <w:top w:val="single" w:sz="1" w:space="0" w:color="B0C4DE"/>
+              <w:left w:val="single" w:sz="1" w:space="0" w:color="B0C4DE"/>
+              <w:bottom w:val="single" w:sz="1" w:space="0" w:color="B0C4DE"/>
+              <w:right w:val="single" w:sz="1" w:space="0" w:color="B0C4DE"/>
+            </w:tcBorders>
+            <w:shd w:val="clear" w:color="auto" w:fill="FFFFFF"/>
+            <w:tcMar>
+              <w:top w:w="70" w:type="dxa"/>
+              <w:left w:w="100" w:type="dxa"/>
+              <w:bottom w:w="70" w:type="dxa"/>
+              <w:right w:w="100" w:type="dxa"/>
+            </w:tcMar>
+          </w:tcPr>
+          <w:p>
+            <w:pPr>
+              <w:jc w:val="center"/>
+              <w:rPr>
+                <w:sz w:val="32"/>
+                <w:szCs w:val="32"/>
+              </w:rPr>
+            </w:pPr>
+            <w:proofErr w:type="spellStart"/>
+            <w:proofErr w:type="spellEnd"/>
+            <w:r>
+              <w:rPr>
+                <w:color w:val="1A1A2E"/>
+                <w:sz w:val="32"/>
+                <w:szCs w:val="32"/>
+              </w:rPr>
+              <w:t xml:space="preserve">ชุด</w:t>
+            </w:r>
+          </w:p>
+        </w:tc>
+        <w:tc>
+          <w:tcPr>
+            <w:tcW w:w="0" w:type="auto"/>
+            <w:tcBorders>
+              <w:top w:val="single" w:sz="1" w:space="0" w:color="B0C4DE"/>
+              <w:left w:val="single" w:sz="1" w:space="0" w:color="B0C4DE"/>
+              <w:bottom w:val="single" w:sz="1" w:space="0" w:color="B0C4DE"/>
+              <w:right w:val="single" w:sz="1" w:space="0" w:color="B0C4DE"/>
+            </w:tcBorders>
+            <w:shd w:val="clear" w:color="auto" w:fill="FFFFFF"/>
+            <w:tcMar>
+              <w:top w:w="70" w:type="dxa"/>
+              <w:left w:w="100" w:type="dxa"/>
+              <w:bottom w:w="70" w:type="dxa"/>
+              <w:right w:w="100" w:type="dxa"/>
+            </w:tcMar>
+          </w:tcPr>
+          <w:p>
+            <w:pPr>
+              <w:jc w:val="center"/>
+              <w:rPr>
+                <w:sz w:val="32"/>
+                <w:szCs w:val="32"/>
+              </w:rPr>
+            </w:pPr>
+            <w:r>
+              <w:rPr>
+                <w:color w:val="1A1A2E"/>
+                <w:sz w:val="32"/>
+                <w:szCs w:val="32"/>
+              </w:rPr>
+              <w:t xml:space="preserve">2,000,000</w:t>
+            </w:r>
+          </w:p>
+        </w:tc>
+        <w:tc>
+          <w:tcPr>
+            <w:tcW w:w="0" w:type="auto"/>
+            <w:tcBorders>
+              <w:top w:val="single" w:sz="1" w:space="0" w:color="B0C4DE"/>
+              <w:left w:val="single" w:sz="1" w:space="0" w:color="B0C4DE"/>
+              <w:bottom w:val="single" w:sz="1" w:space="0" w:color="B0C4DE"/>
+              <w:right w:val="single" w:sz="1" w:space="0" w:color="B0C4DE"/>
+            </w:tcBorders>
+            <w:shd w:val="clear" w:color="auto" w:fill="FFFFFF"/>
+            <w:tcMar>
+              <w:top w:w="70" w:type="dxa"/>
+              <w:left w:w="100" w:type="dxa"/>
+              <w:bottom w:w="70" w:type="dxa"/>
+              <w:right w:w="100" w:type="dxa"/>
+            </w:tcMar>
+          </w:tcPr>
+          <w:p>
+            <w:pPr>
+              <w:jc w:val="center"/>
+              <w:rPr>
+                <w:sz w:val="32"/>
+                <w:szCs w:val="32"/>
+              </w:rPr>
+            </w:pPr>
+            <w:r>
+              <w:rPr>
+                <w:b/>
+                <w:bCs/>
+                <w:color w:val="1A3A6B"/>
+                <w:sz w:val="32"/>
+                <w:szCs w:val="32"/>
+              </w:rPr>
+              <w:t xml:space="preserve">2,000,000</w:t>
+            </w:r>
+          </w:p>
+        </w:tc>
+      </w:tr>
+      <w:tr>
+        <w:tblPrEx>
+          <w:tblCellMar>
+            <w:top w:w="0" w:type="dxa"/>
+            <w:bottom w:w="0" w:type="dxa"/>
+          </w:tblCellMar>
+        </w:tblPrEx>
+        <w:tc>
+          <w:tcPr>
+            <w:tcW w:w="0" w:type="auto"/>
             <w:gridSpan w:val="6"/>
             <w:tcBorders>
               <w:top w:val="single" w:sz="1" w:space="0" w:color="2B5EA7"/>
@@ -27464,7 +28937,7 @@
                 <w:sz w:val="32"/>
                 <w:szCs w:val="32"/>
               </w:rPr>
-              <w:t xml:space="preserve">รวมอุปกรณ์สนับสนุน (12.1–12.8)</w:t>
+              <w:t xml:space="preserve">รวมอุปกรณ์สนับสนุน (12.1–12.13)</w:t>
             </w:r>
           </w:p>
         </w:tc>
@@ -27501,7 +28974,7 @@
                 <w:sz w:val="32"/>
                 <w:szCs w:val="32"/>
               </w:rPr>
-              <w:t xml:space="preserve">8,950,000</w:t>
+              <w:t xml:space="preserve">26,950,000</w:t>
             </w:r>
           </w:p>
         </w:tc>
@@ -27584,7 +29057,7 @@
                 <w:sz w:val="32"/>
                 <w:szCs w:val="32"/>
               </w:rPr>
-              <w:t xml:space="preserve">วงเงินรวมหมวดที่ 3  :  ครุภัณฑ์ Robotics Lab  (รายการ 8.1–12.8)</w:t>
+              <w:t xml:space="preserve">วงเงินรวมหมวดที่ 3  :  ครุภัณฑ์ Robotics Lab  (รายการ 8.1–12.13)</w:t>
             </w:r>
           </w:p>
         </w:tc>
@@ -27621,7 +29094,7 @@
                 <w:sz w:val="32"/>
                 <w:szCs w:val="32"/>
               </w:rPr>
-              <w:t xml:space="preserve">50,000,000</w:t>
+              <w:t xml:space="preserve">68,000,000</w:t>
             </w:r>
           </w:p>
         </w:tc>
@@ -27713,57 +29186,7 @@
                 <w:sz w:val="28"/>
                 <w:szCs w:val="28"/>
               </w:rPr>
-              <w:t xml:space="preserve">หมายเหตุ: | </w:t>
-            </w:r>
-            <w:r>
-              <w:rPr>
-                <w:b/>
-                <w:bCs/>
-                <w:color w:val="1A1A2E"/>
-                <w:sz w:val="28"/>
-                <w:szCs w:val="28"/>
-              </w:rPr>
-              <w:t xml:space="preserve">เพิ่มรายการ 12.8 Humanoid Robot Platform (Unitree G1) 2 ตัว เพื่อสอดคล้องกับเสาหลักด้าน Humanoid Robotics ของโครงการ และแผนความร่วมมือกับ UBTECH, Unitree และ Fourier Intelligence | </w:t>
-            </w:r>
-            <w:r>
-              <w:rPr>
-                <w:b/>
-                <w:bCs/>
-                <w:color w:val="1A1A2E"/>
-                <w:sz w:val="28"/>
-                <w:szCs w:val="28"/>
-              </w:rPr>
-              <w:t xml:space="preserve">เปลี่ยนรายการ 12.6 จาก da Vinci Simulation เป็น MicroPort Toumai Surgical Trainer เพื่อสอดคล้องกับแผนพันธมิตรจีนด้าน Healthcare Robotics และต้นทุนที่ต่ำกว่า | </w:t>
-            </w:r>
-            <w:r>
-              <w:rPr>
-                <w:b/>
-                <w:bCs/>
-                <w:color w:val="1A1A2E"/>
-                <w:sz w:val="28"/>
-                <w:szCs w:val="28"/>
-              </w:rPr>
-              <w:t xml:space="preserve">รายการ 12.7 Agricultural Robot Kit ลดจาก 2 ชุดเป็น 1 ชุด เป็น Flagship ที่สอดคล้องกับ Research Cluster ด้าน AI for Agriculture ของ มฟล. | </w:t>
-            </w:r>
-            <w:r>
-              <w:rPr>
-                <w:b/>
-                <w:bCs/>
-                <w:color w:val="1A1A2E"/>
-                <w:sz w:val="28"/>
-                <w:szCs w:val="28"/>
-              </w:rPr>
-              <w:t xml:space="preserve">ค่าต่ออายุ License (Isaac Sim, ROS2, Isaac ROS) หลังปีที่ 3 ประมาณ 900,000 บาท/ปี จะจ่ายจากงบดำเนินการ | </w:t>
-            </w:r>
-            <w:r>
-              <w:rPr>
-                <w:b/>
-                <w:bCs/>
-                <w:color w:val="1A1A2E"/>
-                <w:sz w:val="28"/>
-                <w:szCs w:val="28"/>
-              </w:rPr>
-              <w:t xml:space="preserve">ค่าบำรุงรักษาหุ่นยนต์และอุปกรณ์ Robotics Lab ปีที่ 2–5 ประมาณ 8–12% ของมูลค่าครุภัณฑ์ต่อปี (ประมาณ 4–6 ล้านบาท/ปี) จ่ายจากงบดำเนินการ</w:t>
+              <w:t xml:space="preserve">หมายเหตุ: | เพิ่มรายการ 12.8 Humanoid Robot Platform (Unitree G1) 2 ตัว เพื่อสอดคล้องกับ เสาหลักด้าน Humanoid Robotics ของโครงการ | เพิ่มรายการ 12.9–12.13 Humanoid Robot หลากหลายประเภท รวม 5 รายการ 18 ล้านบาท ครอบคลุม 4 ภาคอุตสาหกรรมเป้าหมาย: (1) Research — Unitree H1 วิจัย Locomotion/HRI, (2) Healthcare — Fourier GR-2 สำหรับ Rehabilitation, (3) Service — UBTECH Walker S สำหรับ Hospitality, (4) Industrial — Kepler K2 สำหรับ Manufacturing | สอดคล้องกับแผนความร่วมมือกับ UBTECH, Unitree, Fourier Intelligence และ Kepler Robotics | วงเงินรวมหมวดที่ 3 ปรับจาก 50 ล้านบาท เป็น 68 ล้านบาท</w:t>
             </w:r>
           </w:p>
         </w:tc>
@@ -27895,18 +29318,8 @@
                 <w:sz w:val="28"/>
                 <w:szCs w:val="28"/>
               </w:rPr>
-              <w:t xml:space="preserve">ตารางสรุปวงเงินงบลงทุนรวม 3 หมวดหลัก</w:t>
-            </w:r>
-            <w:r>
-              <w:rPr>
-                <w:b/>
-                <w:bCs/>
-                <w:color w:val="1A1A2E"/>
-                <w:sz w:val="28"/>
-                <w:szCs w:val="28"/>
-              </w:rPr>
-              <w:br/>
-              <w:t xml:space="preserve">งบลงทุนทั้งหมดของศูนย์ MFU-ARIC (ปีที่ 1–5) รวม 130 ล้านบาท ประกอบด้วย 3 หมวดหลัก 61 รายการครุภัณฑ์ รองรับการดำเนินงานครบทั้ง 4 องค์ประกอบหลัก (Innovation, Education, Applied Research, Regional)</w:t>
+              <w:t xml:space="preserve">ตารางสรุปวงเงินงบลงทุนรวม 3 หมวดหลัก
+งบลงทุนทั้งหมดของศูนย์ MFU-ARIC (ปีที่ 1–5) รวม 150 ล้านบาท ประกอบด้วย 3 หมวดหลัก 67 รายการครุภัณฑ์ รองรับการดำเนินงานครบทั้ง 4 องค์ประกอบหลัก (Innovation, Education, Applied Research, Regional)</w:t>
             </w:r>
           </w:p>
         </w:tc>
@@ -29103,7 +30516,7 @@
                 <w:sz w:val="32"/>
                 <w:szCs w:val="32"/>
               </w:rPr>
-              <w:t xml:space="preserve">15 รายการ</w:t>
+              <w:t xml:space="preserve">16 รายการ</w:t>
             </w:r>
           </w:p>
         </w:tc>
@@ -29140,7 +30553,7 @@
                 <w:sz w:val="32"/>
                 <w:szCs w:val="32"/>
               </w:rPr>
-              <w:t xml:space="preserve">65,000,000</w:t>
+              <w:t xml:space="preserve">67,000,000</w:t>
             </w:r>
           </w:p>
         </w:tc>
@@ -29555,7 +30968,7 @@
                 <w:sz w:val="32"/>
                 <w:szCs w:val="32"/>
               </w:rPr>
-              <w:t>• Workstation &amp; Software (6.1–6.4)</w:t>
+              <w:t xml:space="preserve">• Workstation &amp; Software (6.1–6.5)</w:t>
             </w:r>
           </w:p>
         </w:tc>
@@ -29589,7 +31002,7 @@
                 <w:sz w:val="32"/>
                 <w:szCs w:val="32"/>
               </w:rPr>
-              <w:t>Research WS, AI WS, HPC Software</w:t>
+              <w:t xml:space="preserve">Research WS, AI WS, DGX Spark, HPC Software</w:t>
             </w:r>
           </w:p>
         </w:tc>
@@ -29624,7 +31037,7 @@
                 <w:sz w:val="32"/>
                 <w:szCs w:val="32"/>
               </w:rPr>
-              <w:t xml:space="preserve">4</w:t>
+              <w:t xml:space="preserve">5</w:t>
             </w:r>
           </w:p>
         </w:tc>
@@ -29659,7 +31072,7 @@
                 <w:sz w:val="32"/>
                 <w:szCs w:val="32"/>
               </w:rPr>
-              <w:t xml:space="preserve">10,200,000</w:t>
+              <w:t xml:space="preserve">12,200,000</w:t>
             </w:r>
           </w:p>
         </w:tc>
@@ -30008,7 +31421,7 @@
                 <w:sz w:val="32"/>
                 <w:szCs w:val="32"/>
               </w:rPr>
-              <w:t xml:space="preserve">29 รายการ</w:t>
+              <w:t xml:space="preserve">34 รายการ</w:t>
             </w:r>
           </w:p>
         </w:tc>
@@ -30045,7 +31458,7 @@
                 <w:sz w:val="32"/>
                 <w:szCs w:val="32"/>
               </w:rPr>
-              <w:t xml:space="preserve">50,000,000</w:t>
+              <w:t xml:space="preserve">68,000,000</w:t>
             </w:r>
           </w:p>
         </w:tc>
@@ -30806,7 +32219,7 @@
                 <w:sz w:val="32"/>
                 <w:szCs w:val="32"/>
               </w:rPr>
-              <w:t xml:space="preserve">• Lab Equipment &amp; Support (12.1–12.8)</w:t>
+              <w:t xml:space="preserve">• Lab Equipment, Humanoid Robots &amp; Support (12.1–12.13)</w:t>
             </w:r>
           </w:p>
         </w:tc>
@@ -30840,7 +32253,7 @@
                 <w:sz w:val="32"/>
                 <w:szCs w:val="32"/>
               </w:rPr>
-              <w:t xml:space="preserve">3D Printer, Electronics, Toumai, Agri-Robot, Humanoid</w:t>
+              <w:t xml:space="preserve">3D Printer, Electronics, Toumai, Agri-Robot, Unitree G1/H1, Fourier GR-2, UBTECH Walker S, Kepler K2</w:t>
             </w:r>
           </w:p>
         </w:tc>
@@ -30875,7 +32288,7 @@
                 <w:sz w:val="32"/>
                 <w:szCs w:val="32"/>
               </w:rPr>
-              <w:t xml:space="preserve">8</w:t>
+              <w:t xml:space="preserve">13</w:t>
             </w:r>
           </w:p>
         </w:tc>
@@ -30910,7 +32323,7 @@
                 <w:sz w:val="32"/>
                 <w:szCs w:val="32"/>
               </w:rPr>
-              <w:t xml:space="preserve">8,950,000</w:t>
+              <w:t xml:space="preserve">26,950,000</w:t>
             </w:r>
           </w:p>
         </w:tc>
@@ -30965,7 +32378,7 @@
                 <w:sz w:val="32"/>
                 <w:szCs w:val="32"/>
               </w:rPr>
-              <w:t xml:space="preserve">รวมงบลงทุน (Capital Expenditure) ทั้งหมด  3 หมวด  60 รายการ</w:t>
+              <w:t xml:space="preserve">67 รายการ</w:t>
             </w:r>
           </w:p>
         </w:tc>
@@ -31002,7 +32415,7 @@
                 <w:sz w:val="32"/>
                 <w:szCs w:val="32"/>
               </w:rPr>
-              <w:t xml:space="preserve">130,000,000</w:t>
+              <w:t xml:space="preserve">150,000,000</w:t>
             </w:r>
           </w:p>
         </w:tc>
@@ -31575,7 +32988,7 @@
                 <w:sz w:val="32"/>
                 <w:szCs w:val="32"/>
               </w:rPr>
-              <w:t xml:space="preserve">35,000,000</w:t>
+              <w:t xml:space="preserve">37,000,000</w:t>
             </w:r>
           </w:p>
         </w:tc>
@@ -31682,7 +33095,7 @@
                 <w:sz w:val="32"/>
                 <w:szCs w:val="32"/>
               </w:rPr>
-              <w:t xml:space="preserve">65,000,000</w:t>
+              <w:t xml:space="preserve">67,000,000</w:t>
             </w:r>
           </w:p>
         </w:tc>
@@ -31773,7 +33186,7 @@
                 <w:sz w:val="32"/>
                 <w:szCs w:val="32"/>
               </w:rPr>
-              <w:t xml:space="preserve">20,000,000</w:t>
+              <w:t xml:space="preserve">25,000,000</w:t>
             </w:r>
           </w:p>
         </w:tc>
@@ -31808,7 +33221,7 @@
                 <w:sz w:val="32"/>
                 <w:szCs w:val="32"/>
               </w:rPr>
-              <w:t xml:space="preserve">22,000,000</w:t>
+              <w:t xml:space="preserve">35,000,000</w:t>
             </w:r>
           </w:p>
         </w:tc>
@@ -31880,7 +33293,7 @@
                 <w:sz w:val="32"/>
                 <w:szCs w:val="32"/>
               </w:rPr>
-              <w:t xml:space="preserve">50,000,000</w:t>
+              <w:t xml:space="preserve">68,000,000</w:t>
             </w:r>
           </w:p>
         </w:tc>
@@ -31963,7 +33376,7 @@
                 <w:sz w:val="32"/>
                 <w:szCs w:val="32"/>
               </w:rPr>
-              <w:t xml:space="preserve">65,000,000</w:t>
+              <w:t xml:space="preserve">72,000,000</w:t>
             </w:r>
           </w:p>
         </w:tc>
@@ -32000,7 +33413,7 @@
                 <w:sz w:val="32"/>
                 <w:szCs w:val="32"/>
               </w:rPr>
-              <w:t xml:space="preserve">50,000,000</w:t>
+              <w:t xml:space="preserve">63,000,000</w:t>
             </w:r>
           </w:p>
         </w:tc>
@@ -32074,7 +33487,7 @@
                 <w:sz w:val="32"/>
                 <w:szCs w:val="32"/>
               </w:rPr>
-              <w:t xml:space="preserve">130,000,000</w:t>
+              <w:t xml:space="preserve">150,000,000</w:t>
             </w:r>
           </w:p>
         </w:tc>

</xml_diff>